<commit_message>
feat: add sobre assembly, template tokenization, image insertion, and AI improvements
- Tokenize all 49 form templates (firma, sello, logo image placeholders + text fields)
- Add image insertion via PhpWord setImageValue() with custom sizes for caratulas
- Add file upload flow directly in checklist assignment drawer
- Add Sobre A/B assembly system: assign requirements to sobres, generate per-sobre PDF ZIPs
- Improve AI pliego analysis prompt for higher extraction consistency, cap confidence at 99
- Replace Gemini branding with generic "IA" in all user-facing UI
- Remove [informacion de contacto] from all form templates

Co-Authored-By: Claude Opus 4.6 <noreply@anthropic.com>
</commit_message>
<xml_diff>
--- a/resources/form_templates/aseguradoras/FORMULARIO_SOLICITUD_DE_FIANZA_APS_formato-1.docx
+++ b/resources/form_templates/aseguradoras/FORMULARIO_SOLICITUD_DE_FIANZA_APS_formato-1.docx
@@ -1869,7 +1869,7 @@
           <w:sz w:val="22"/>
           <w:szCs w:val="22"/>
         </w:rPr>
-        <w:t xml:space="preserve">[Firma del gerente de su empresa] </w:t>
+        <w:t xml:space="preserve">${img_firma} </w:t>
       </w:r>
       <w:r>
         <w:rPr>
@@ -1877,7 +1877,7 @@
           <w:szCs w:val="22"/>
           <w:lang/>
         </w:rPr>
-        <w:t xml:space="preserve">[Sello de su empresa]</w:t>
+        <w:t xml:space="preserve">${img_sello}</w:t>
       </w:r>
       <w:r>
         <w:rPr>

</xml_diff>